<commit_message>
docs: start v2.2 report period on 21.10.2026
Co-Authored-By: Claude Opus 5.5 <noreply@anthropic.com>
</commit_message>
<xml_diff>
--- a/Historia wersji oraz md/Historia wersji/AMSteel_Quote_Raport_Wersji_2.2.docx
+++ b/Historia wersji oraz md/Historia wersji/AMSteel_Quote_Raport_Wersji_2.2.docx
@@ -115,7 +115,7 @@
           </w:tcPr>
           <w:p>
             <w:r>
-              <w:t xml:space="preserve">22.10.2026 - </w:t>
+              <w:t xml:space="preserve">21.10.2026 - </w:t>
             </w:r>
           </w:p>
         </w:tc>
@@ -260,7 +260,7 @@
           </w:tcPr>
           <w:p>
             <w:r>
-              <w:t xml:space="preserve">22.10.2026 - </w:t>
+              <w:t xml:space="preserve">21.10.2026 - </w:t>
             </w:r>
           </w:p>
         </w:tc>

</xml_diff>

<commit_message>
fix: stop light theme radius rule clipping the ArcelorMittal logo, bump badge to v2.2
The light theme's 14px radius override out-specified the logo tile's radius
reset and clipped the "A". Exclude the tile from that rule and size the logo
from the SVG aspect ratio (52px header, 60px login) so the wordmark stays
legible in dark mode. Logged in the v2.2 report.

Co-Authored-By: Claude Opus 5.5 <noreply@anthropic.com>
</commit_message>
<xml_diff>
--- a/Historia wersji oraz md/Historia wersji/AMSteel_Quote_Raport_Wersji_2.2.docx
+++ b/Historia wersji oraz md/Historia wersji/AMSteel_Quote_Raport_Wersji_2.2.docx
@@ -1355,7 +1355,9 @@
             <w:tcW w:w="1948" w:type="dxa"/>
           </w:tcPr>
           <w:p>
-            <w:r/>
+            <w:r>
+              <w:t>Zmiana</w:t>
+            </w:r>
           </w:p>
         </w:tc>
         <w:tc>
@@ -1363,7 +1365,31 @@
             <w:tcW w:w="6908" w:type="dxa"/>
           </w:tcPr>
           <w:p>
-            <w:r/>
+            <w:r>
+              <w:t>Plakietka wersji w nagłówku aplikacji zmieniona na v2.2 (wszystkie 4 języki: PL / EN / CZ / DE).</w:t>
+            </w:r>
+          </w:p>
+        </w:tc>
+      </w:tr>
+      <w:tr>
+        <w:tc>
+          <w:tcPr>
+            <w:tcW w:w="1948" w:type="dxa"/>
+          </w:tcPr>
+          <w:p>
+            <w:r>
+              <w:t>Poprawka wizualna</w:t>
+            </w:r>
+          </w:p>
+        </w:tc>
+        <w:tc>
+          <w:tcPr>
+            <w:tcW w:w="6908" w:type="dxa"/>
+          </w:tcPr>
+          <w:p>
+            <w:r>
+              <w:t>Logo ArcelorMittal w nagłówku: w jasnym motywie ogólna reguła zaokrąglania rogów (14 px) nadpisywała zerowe zaokrąglenie pola logo i ucinała lewą nóżkę litery „A” (stąd „rozmyta” litera i cieńsze linie całego logo). Pole logo wyłączone z tej reguły. Dodatkowo logo powiększone z 40 px do 52 px wysokości (ekran logowania 60 px), a szerokość liczona z proporcji pliku SVG zamiast stałego pola 132 px - w ciemnym motywie białe litery były za małe i widać było artefakty krawędzi.</w:t>
+            </w:r>
           </w:p>
         </w:tc>
       </w:tr>

</xml_diff>